<commit_message>
feat(document): CRDES-46968: DOCUMENTS for Plazo DEBT SALE- 31/08
</commit_message>
<xml_diff>
--- a/template/agreement/court_checkboxes_plazo_credit.docx
+++ b/template/agreement/court_checkboxes_plazo_credit.docx
@@ -163,7 +163,7 @@
           <w:b/>
           <w:bCs/>
         </w:rPr>
-        <w:instrText xml:space="preserve"> MERGEFIELD  $loan.id  \* MERGEFORMAT </w:instrText>
+        <w:instrText xml:space="preserve"> MERGEFIELD  $creditId  \* MERGEFORMAT </w:instrText>
       </w:r>
       <w:r>
         <w:rPr>
@@ -180,7 +180,7 @@
           <w:bCs/>
           <w:noProof/>
         </w:rPr>
-        <w:t>«$loan.id»</w:t>
+        <w:t>«$creditId»</w:t>
       </w:r>
       <w:r>
         <w:rPr>
@@ -217,688 +217,661 @@
         </w:rPr>
       </w:pPr>
     </w:p>
+    <w:tbl>
+      <w:tblPr>
+        <w:tblStyle w:val="a9"/>
+        <w:tblW w:w="8926" w:type="dxa"/>
+        <w:tblInd w:w="-142" w:type="dxa"/>
+        <w:tblBorders>
+          <w:top w:val="none" w:sz="0" w:space="0" w:color="auto"/>
+          <w:left w:val="none" w:sz="0" w:space="0" w:color="auto"/>
+          <w:bottom w:val="none" w:sz="0" w:space="0" w:color="auto"/>
+          <w:right w:val="none" w:sz="0" w:space="0" w:color="auto"/>
+          <w:insideH w:val="none" w:sz="0" w:space="0" w:color="auto"/>
+          <w:insideV w:val="none" w:sz="0" w:space="0" w:color="auto"/>
+        </w:tblBorders>
+        <w:tblLayout w:type="fixed"/>
+        <w:tblLook w:val="04A0" w:firstRow="1" w:lastRow="0" w:firstColumn="1" w:lastColumn="0" w:noHBand="0" w:noVBand="1"/>
+      </w:tblPr>
+      <w:tblGrid>
+        <w:gridCol w:w="384"/>
+        <w:gridCol w:w="8542"/>
+      </w:tblGrid>
+      <w:tr>
+        <w:trPr>
+          <w:trHeight w:val="208"/>
+        </w:trPr>
+        <w:tc>
+          <w:tcPr>
+            <w:tcW w:w="384" w:type="dxa"/>
+          </w:tcPr>
+          <w:p>
+            <w:pPr>
+              <w:spacing w:after="0" w:line="240" w:lineRule="auto"/>
+              <w:ind w:left="0" w:right="-397" w:firstLine="0"/>
+              <w:rPr>
+                <w:rFonts w:asciiTheme="minorHAnsi" w:hAnsiTheme="minorHAnsi" w:cstheme="minorHAnsi"/>
+                <w:lang w:val="en-US"/>
+              </w:rPr>
+            </w:pPr>
+            <w:r>
+              <w:rPr>
+                <w:rFonts w:asciiTheme="minorHAnsi" w:hAnsiTheme="minorHAnsi" w:cstheme="minorHAnsi"/>
+                <w:lang w:val="ru-RU"/>
+              </w:rPr>
+              <w:t>1</w:t>
+            </w:r>
+            <w:r>
+              <w:rPr>
+                <w:rFonts w:asciiTheme="minorHAnsi" w:hAnsiTheme="minorHAnsi" w:cstheme="minorHAnsi"/>
+                <w:lang w:val="en-US"/>
+              </w:rPr>
+              <w:t>.</w:t>
+            </w:r>
+          </w:p>
+        </w:tc>
+        <w:tc>
+          <w:tcPr>
+            <w:tcW w:w="8542" w:type="dxa"/>
+          </w:tcPr>
+          <w:p>
+            <w:pPr>
+              <w:pStyle w:val="a8"/>
+              <w:numPr>
+                <w:ilvl w:val="0"/>
+                <w:numId w:val="2"/>
+              </w:numPr>
+              <w:spacing w:after="0" w:line="240" w:lineRule="auto"/>
+              <w:ind w:left="426" w:right="0" w:hanging="426"/>
+              <w:rPr>
+                <w:rFonts w:asciiTheme="minorHAnsi" w:hAnsiTheme="minorHAnsi" w:cstheme="minorHAnsi"/>
+              </w:rPr>
+            </w:pPr>
+            <w:r>
+              <w:rPr>
+                <w:rFonts w:asciiTheme="minorHAnsi" w:hAnsiTheme="minorHAnsi" w:cstheme="minorHAnsi"/>
+              </w:rPr>
+              <w:t>Los Términos y Condiciones Particulares y Generales del referido contrato de préstamo.</w:t>
+            </w:r>
+          </w:p>
+        </w:tc>
+      </w:tr>
+      <w:tr>
+        <w:tc>
+          <w:tcPr>
+            <w:tcW w:w="384" w:type="dxa"/>
+          </w:tcPr>
+          <w:p>
+            <w:pPr>
+              <w:spacing w:after="0" w:line="240" w:lineRule="auto"/>
+              <w:ind w:left="0" w:right="-397" w:firstLine="0"/>
+              <w:rPr>
+                <w:rFonts w:asciiTheme="minorHAnsi" w:hAnsiTheme="minorHAnsi" w:cstheme="minorHAnsi"/>
+              </w:rPr>
+            </w:pPr>
+          </w:p>
+        </w:tc>
+        <w:tc>
+          <w:tcPr>
+            <w:tcW w:w="8542" w:type="dxa"/>
+          </w:tcPr>
+          <w:p>
+            <w:pPr>
+              <w:pStyle w:val="a8"/>
+              <w:spacing w:before="240" w:after="0" w:line="240" w:lineRule="auto"/>
+              <w:ind w:left="0" w:right="170" w:firstLine="0"/>
+              <w:rPr>
+                <w:rFonts w:asciiTheme="minorHAnsi" w:hAnsiTheme="minorHAnsi" w:cstheme="minorHAnsi"/>
+              </w:rPr>
+            </w:pPr>
+            <w:r>
+              <w:rPr>
+                <w:rFonts w:asciiTheme="minorHAnsi" w:hAnsiTheme="minorHAnsi" w:cstheme="minorHAnsi"/>
+              </w:rPr>
+              <w:t xml:space="preserve">De acuerdo con los datos que figuran en nuestra Base de Datos, el cliente/a Sr./a </w:t>
+            </w:r>
+            <w:r>
+              <w:rPr>
+                <w:rFonts w:asciiTheme="minorHAnsi" w:hAnsiTheme="minorHAnsi" w:cstheme="minorHAnsi"/>
+              </w:rPr>
+              <w:fldChar w:fldCharType="begin"/>
+            </w:r>
+            <w:r>
+              <w:rPr>
+                <w:rFonts w:asciiTheme="minorHAnsi" w:hAnsiTheme="minorHAnsi" w:cstheme="minorHAnsi"/>
+              </w:rPr>
+              <w:instrText xml:space="preserve"> MERGEFIELD  $fullName  \* MERGEFORMAT </w:instrText>
+            </w:r>
+            <w:r>
+              <w:rPr>
+                <w:rFonts w:asciiTheme="minorHAnsi" w:hAnsiTheme="minorHAnsi" w:cstheme="minorHAnsi"/>
+              </w:rPr>
+              <w:fldChar w:fldCharType="separate"/>
+            </w:r>
+            <w:r>
+              <w:rPr>
+                <w:rFonts w:asciiTheme="minorHAnsi" w:hAnsiTheme="minorHAnsi" w:cstheme="minorHAnsi"/>
+                <w:noProof/>
+              </w:rPr>
+              <w:t>«$fullName»</w:t>
+            </w:r>
+            <w:r>
+              <w:rPr>
+                <w:rFonts w:asciiTheme="minorHAnsi" w:hAnsiTheme="minorHAnsi" w:cstheme="minorHAnsi"/>
+              </w:rPr>
+              <w:fldChar w:fldCharType="end"/>
+            </w:r>
+            <w:r>
+              <w:rPr>
+                <w:rFonts w:asciiTheme="minorHAnsi" w:hAnsiTheme="minorHAnsi" w:cstheme="minorHAnsi"/>
+              </w:rPr>
+              <w:t xml:space="preserve"> ofreció su aceptación electrónica el pasado día </w:t>
+            </w:r>
+            <w:r>
+              <w:rPr>
+                <w:rFonts w:asciiTheme="minorHAnsi" w:hAnsiTheme="minorHAnsi" w:cstheme="minorHAnsi"/>
+              </w:rPr>
+              <w:fldChar w:fldCharType="begin"/>
+            </w:r>
+            <w:r>
+              <w:rPr>
+                <w:rFonts w:asciiTheme="minorHAnsi" w:hAnsiTheme="minorHAnsi" w:cstheme="minorHAnsi"/>
+              </w:rPr>
+              <w:instrText xml:space="preserve"> MERGEFIELD  $contractParams.formattedDate  \* MERGEFORMAT </w:instrText>
+            </w:r>
+            <w:r>
+              <w:rPr>
+                <w:rFonts w:asciiTheme="minorHAnsi" w:hAnsiTheme="minorHAnsi" w:cstheme="minorHAnsi"/>
+              </w:rPr>
+              <w:fldChar w:fldCharType="separate"/>
+            </w:r>
+            <w:r>
+              <w:rPr>
+                <w:rFonts w:asciiTheme="minorHAnsi" w:hAnsiTheme="minorHAnsi" w:cstheme="minorHAnsi"/>
+                <w:noProof/>
+              </w:rPr>
+              <w:t>«$contractParams.formattedDate»</w:t>
+            </w:r>
+            <w:r>
+              <w:rPr>
+                <w:rFonts w:asciiTheme="minorHAnsi" w:hAnsiTheme="minorHAnsi" w:cstheme="minorHAnsi"/>
+              </w:rPr>
+              <w:fldChar w:fldCharType="end"/>
+            </w:r>
+            <w:r>
+              <w:rPr>
+                <w:rFonts w:asciiTheme="minorHAnsi" w:hAnsiTheme="minorHAnsi" w:cstheme="minorHAnsi"/>
+              </w:rPr>
+              <w:t xml:space="preserve"> a las </w:t>
+            </w:r>
+            <w:r>
+              <w:rPr>
+                <w:rFonts w:asciiTheme="minorHAnsi" w:hAnsiTheme="minorHAnsi" w:cstheme="minorHAnsi"/>
+              </w:rPr>
+              <w:fldChar w:fldCharType="begin"/>
+            </w:r>
+            <w:r>
+              <w:rPr>
+                <w:rFonts w:asciiTheme="minorHAnsi" w:hAnsiTheme="minorHAnsi" w:cstheme="minorHAnsi"/>
+              </w:rPr>
+              <w:instrText xml:space="preserve"> MERGEFIELD  $contractParams.hour  \* MERGEFORMAT </w:instrText>
+            </w:r>
+            <w:r>
+              <w:rPr>
+                <w:rFonts w:asciiTheme="minorHAnsi" w:hAnsiTheme="minorHAnsi" w:cstheme="minorHAnsi"/>
+              </w:rPr>
+              <w:fldChar w:fldCharType="separate"/>
+            </w:r>
+            <w:r>
+              <w:rPr>
+                <w:rFonts w:asciiTheme="minorHAnsi" w:hAnsiTheme="minorHAnsi" w:cstheme="minorHAnsi"/>
+                <w:noProof/>
+              </w:rPr>
+              <w:t>«$contractParams.hour»</w:t>
+            </w:r>
+            <w:r>
+              <w:rPr>
+                <w:rFonts w:asciiTheme="minorHAnsi" w:hAnsiTheme="minorHAnsi" w:cstheme="minorHAnsi"/>
+              </w:rPr>
+              <w:fldChar w:fldCharType="end"/>
+            </w:r>
+            <w:r>
+              <w:rPr>
+                <w:rFonts w:asciiTheme="minorHAnsi" w:hAnsiTheme="minorHAnsi" w:cstheme="minorHAnsi"/>
+              </w:rPr>
+              <w:fldChar w:fldCharType="begin"/>
+            </w:r>
+            <w:r>
+              <w:rPr>
+                <w:rFonts w:asciiTheme="minorHAnsi" w:hAnsiTheme="minorHAnsi" w:cstheme="minorHAnsi"/>
+              </w:rPr>
+              <w:instrText xml:space="preserve"> MERGEFIELD  "#if($contractParams.ip) desde la IP $contractParams.ip#end"  \* MERGEFORMAT </w:instrText>
+            </w:r>
+            <w:r>
+              <w:rPr>
+                <w:rFonts w:asciiTheme="minorHAnsi" w:hAnsiTheme="minorHAnsi" w:cstheme="minorHAnsi"/>
+              </w:rPr>
+              <w:fldChar w:fldCharType="separate"/>
+            </w:r>
+            <w:r>
+              <w:rPr>
+                <w:rFonts w:asciiTheme="minorHAnsi" w:hAnsiTheme="minorHAnsi" w:cstheme="minorHAnsi"/>
+                <w:noProof/>
+              </w:rPr>
+              <w:t>«#if($contractParams.ip) desde la IP $con»</w:t>
+            </w:r>
+            <w:r>
+              <w:rPr>
+                <w:rFonts w:asciiTheme="minorHAnsi" w:hAnsiTheme="minorHAnsi" w:cstheme="minorHAnsi"/>
+              </w:rPr>
+              <w:fldChar w:fldCharType="end"/>
+            </w:r>
+            <w:r>
+              <w:rPr>
+                <w:rFonts w:asciiTheme="minorHAnsi" w:hAnsiTheme="minorHAnsi" w:cstheme="minorHAnsi"/>
+              </w:rPr>
+              <w:t>.</w:t>
+            </w:r>
+          </w:p>
+        </w:tc>
+      </w:tr>
+      <w:tr>
+        <w:trPr>
+          <w:trHeight w:val="256"/>
+        </w:trPr>
+        <w:tc>
+          <w:tcPr>
+            <w:tcW w:w="384" w:type="dxa"/>
+          </w:tcPr>
+          <w:p>
+            <w:pPr>
+              <w:spacing w:before="240" w:after="0" w:line="240" w:lineRule="auto"/>
+              <w:ind w:left="0" w:right="-437" w:firstLine="0"/>
+              <w:rPr>
+                <w:rFonts w:asciiTheme="minorHAnsi" w:hAnsiTheme="minorHAnsi" w:cstheme="minorHAnsi"/>
+              </w:rPr>
+            </w:pPr>
+            <w:r>
+              <w:rPr>
+                <w:rFonts w:asciiTheme="minorHAnsi" w:hAnsiTheme="minorHAnsi" w:cstheme="minorHAnsi"/>
+              </w:rPr>
+              <w:t xml:space="preserve"> 2.</w:t>
+            </w:r>
+          </w:p>
+        </w:tc>
+        <w:tc>
+          <w:tcPr>
+            <w:tcW w:w="8542" w:type="dxa"/>
+          </w:tcPr>
+          <w:p>
+            <w:pPr>
+              <w:spacing w:before="240" w:after="0" w:line="240" w:lineRule="auto"/>
+              <w:ind w:left="0" w:right="170" w:firstLine="0"/>
+              <w:rPr>
+                <w:rFonts w:asciiTheme="minorHAnsi" w:hAnsiTheme="minorHAnsi" w:cstheme="minorHAnsi"/>
+              </w:rPr>
+            </w:pPr>
+            <w:r>
+              <w:rPr>
+                <w:rFonts w:asciiTheme="minorHAnsi" w:hAnsiTheme="minorHAnsi" w:cstheme="minorHAnsi"/>
+              </w:rPr>
+              <w:t>El Formulario de Información Normalizada Europea (INE) sobre crédito al consumo del referido contrato de préstamo</w:t>
+            </w:r>
+            <w:r>
+              <w:rPr>
+                <w:rFonts w:asciiTheme="minorHAnsi" w:hAnsiTheme="minorHAnsi" w:cstheme="minorHAnsi"/>
+              </w:rPr>
+              <w:t>.</w:t>
+            </w:r>
+          </w:p>
+        </w:tc>
+      </w:tr>
+      <w:tr>
+        <w:tc>
+          <w:tcPr>
+            <w:tcW w:w="384" w:type="dxa"/>
+          </w:tcPr>
+          <w:p>
+            <w:pPr>
+              <w:spacing w:before="240" w:after="0" w:line="240" w:lineRule="auto"/>
+              <w:ind w:left="0" w:right="-444" w:firstLine="0"/>
+              <w:rPr>
+                <w:rFonts w:asciiTheme="minorHAnsi" w:hAnsiTheme="minorHAnsi" w:cstheme="minorHAnsi"/>
+              </w:rPr>
+            </w:pPr>
+          </w:p>
+        </w:tc>
+        <w:tc>
+          <w:tcPr>
+            <w:tcW w:w="8542" w:type="dxa"/>
+          </w:tcPr>
+          <w:p>
+            <w:pPr>
+              <w:spacing w:before="240" w:after="0" w:line="240" w:lineRule="auto"/>
+              <w:ind w:left="0" w:right="170" w:firstLine="0"/>
+              <w:rPr>
+                <w:rFonts w:asciiTheme="minorHAnsi" w:hAnsiTheme="minorHAnsi" w:cstheme="minorHAnsi"/>
+              </w:rPr>
+            </w:pPr>
+            <w:r>
+              <w:rPr>
+                <w:rFonts w:asciiTheme="minorHAnsi" w:hAnsiTheme="minorHAnsi" w:cstheme="minorHAnsi"/>
+              </w:rPr>
+              <w:t xml:space="preserve">De acuerdo con los datos que figuran en nuestra Base de Datos, el cliente/a Sr./a </w:t>
+            </w:r>
+            <w:r>
+              <w:rPr>
+                <w:rFonts w:asciiTheme="minorHAnsi" w:hAnsiTheme="minorHAnsi" w:cstheme="minorHAnsi"/>
+              </w:rPr>
+              <w:fldChar w:fldCharType="begin"/>
+            </w:r>
+            <w:r>
+              <w:rPr>
+                <w:rFonts w:asciiTheme="minorHAnsi" w:hAnsiTheme="minorHAnsi" w:cstheme="minorHAnsi"/>
+              </w:rPr>
+              <w:instrText xml:space="preserve"> MERGEFIELD  $fullName  \* MERGEFORMAT </w:instrText>
+            </w:r>
+            <w:r>
+              <w:rPr>
+                <w:rFonts w:asciiTheme="minorHAnsi" w:hAnsiTheme="minorHAnsi" w:cstheme="minorHAnsi"/>
+              </w:rPr>
+              <w:fldChar w:fldCharType="separate"/>
+            </w:r>
+            <w:r>
+              <w:rPr>
+                <w:rFonts w:asciiTheme="minorHAnsi" w:hAnsiTheme="minorHAnsi" w:cstheme="minorHAnsi"/>
+                <w:noProof/>
+              </w:rPr>
+              <w:t>«$fullName»</w:t>
+            </w:r>
+            <w:r>
+              <w:rPr>
+                <w:rFonts w:asciiTheme="minorHAnsi" w:hAnsiTheme="minorHAnsi" w:cstheme="minorHAnsi"/>
+              </w:rPr>
+              <w:fldChar w:fldCharType="end"/>
+            </w:r>
+            <w:r>
+              <w:rPr>
+                <w:rFonts w:asciiTheme="minorHAnsi" w:hAnsiTheme="minorHAnsi" w:cstheme="minorHAnsi"/>
+              </w:rPr>
+              <w:t xml:space="preserve"> ofreció su aceptación electrónica el pasado día </w:t>
+            </w:r>
+            <w:r>
+              <w:rPr>
+                <w:rFonts w:asciiTheme="minorHAnsi" w:hAnsiTheme="minorHAnsi" w:cstheme="minorHAnsi"/>
+              </w:rPr>
+              <w:fldChar w:fldCharType="begin"/>
+            </w:r>
+            <w:r>
+              <w:rPr>
+                <w:rFonts w:asciiTheme="minorHAnsi" w:hAnsiTheme="minorHAnsi" w:cstheme="minorHAnsi"/>
+              </w:rPr>
+              <w:instrText xml:space="preserve"> MERGEFIELD  $preContractParams.formattedDate  \* MERGEFORMAT </w:instrText>
+            </w:r>
+            <w:r>
+              <w:rPr>
+                <w:rFonts w:asciiTheme="minorHAnsi" w:hAnsiTheme="minorHAnsi" w:cstheme="minorHAnsi"/>
+              </w:rPr>
+              <w:fldChar w:fldCharType="separate"/>
+            </w:r>
+            <w:r>
+              <w:rPr>
+                <w:rFonts w:asciiTheme="minorHAnsi" w:hAnsiTheme="minorHAnsi" w:cstheme="minorHAnsi"/>
+                <w:noProof/>
+              </w:rPr>
+              <w:t>«$preContractParams.formattedDate»</w:t>
+            </w:r>
+            <w:r>
+              <w:rPr>
+                <w:rFonts w:asciiTheme="minorHAnsi" w:hAnsiTheme="minorHAnsi" w:cstheme="minorHAnsi"/>
+              </w:rPr>
+              <w:fldChar w:fldCharType="end"/>
+            </w:r>
+            <w:r>
+              <w:rPr>
+                <w:rFonts w:asciiTheme="minorHAnsi" w:hAnsiTheme="minorHAnsi" w:cstheme="minorHAnsi"/>
+              </w:rPr>
+              <w:t xml:space="preserve"> a las </w:t>
+            </w:r>
+            <w:r>
+              <w:rPr>
+                <w:rFonts w:asciiTheme="minorHAnsi" w:hAnsiTheme="minorHAnsi" w:cstheme="minorHAnsi"/>
+              </w:rPr>
+              <w:fldChar w:fldCharType="begin"/>
+            </w:r>
+            <w:r>
+              <w:rPr>
+                <w:rFonts w:asciiTheme="minorHAnsi" w:hAnsiTheme="minorHAnsi" w:cstheme="minorHAnsi"/>
+              </w:rPr>
+              <w:instrText xml:space="preserve"> MERGEFIELD  $preContractParams.hour  \* MERGEFORMAT </w:instrText>
+            </w:r>
+            <w:r>
+              <w:rPr>
+                <w:rFonts w:asciiTheme="minorHAnsi" w:hAnsiTheme="minorHAnsi" w:cstheme="minorHAnsi"/>
+              </w:rPr>
+              <w:fldChar w:fldCharType="separate"/>
+            </w:r>
+            <w:r>
+              <w:rPr>
+                <w:rFonts w:asciiTheme="minorHAnsi" w:hAnsiTheme="minorHAnsi" w:cstheme="minorHAnsi"/>
+                <w:noProof/>
+              </w:rPr>
+              <w:t>«$preContractParams.hour»</w:t>
+            </w:r>
+            <w:r>
+              <w:rPr>
+                <w:rFonts w:asciiTheme="minorHAnsi" w:hAnsiTheme="minorHAnsi" w:cstheme="minorHAnsi"/>
+              </w:rPr>
+              <w:fldChar w:fldCharType="end"/>
+            </w:r>
+            <w:r>
+              <w:rPr>
+                <w:rFonts w:asciiTheme="minorHAnsi" w:hAnsiTheme="minorHAnsi" w:cstheme="minorHAnsi"/>
+              </w:rPr>
+              <w:fldChar w:fldCharType="begin"/>
+            </w:r>
+            <w:r>
+              <w:rPr>
+                <w:rFonts w:asciiTheme="minorHAnsi" w:hAnsiTheme="minorHAnsi" w:cstheme="minorHAnsi"/>
+              </w:rPr>
+              <w:instrText xml:space="preserve"> MERGEFIELD  "#if($preContractParams.ip) desde la IP $preContractParams.ip#end"  \* MERGEFORMAT </w:instrText>
+            </w:r>
+            <w:r>
+              <w:rPr>
+                <w:rFonts w:asciiTheme="minorHAnsi" w:hAnsiTheme="minorHAnsi" w:cstheme="minorHAnsi"/>
+              </w:rPr>
+              <w:fldChar w:fldCharType="separate"/>
+            </w:r>
+            <w:r>
+              <w:rPr>
+                <w:rFonts w:asciiTheme="minorHAnsi" w:hAnsiTheme="minorHAnsi" w:cstheme="minorHAnsi"/>
+                <w:noProof/>
+              </w:rPr>
+              <w:t>«#if($preContractParams.ip) desde la IP $»</w:t>
+            </w:r>
+            <w:r>
+              <w:rPr>
+                <w:rFonts w:asciiTheme="minorHAnsi" w:hAnsiTheme="minorHAnsi" w:cstheme="minorHAnsi"/>
+              </w:rPr>
+              <w:fldChar w:fldCharType="end"/>
+            </w:r>
+            <w:r>
+              <w:rPr>
+                <w:rFonts w:asciiTheme="minorHAnsi" w:hAnsiTheme="minorHAnsi" w:cstheme="minorHAnsi"/>
+              </w:rPr>
+              <w:t>.</w:t>
+            </w:r>
+          </w:p>
+        </w:tc>
+      </w:tr>
+      <w:tr>
+        <w:trPr>
+          <w:trHeight w:val="58"/>
+        </w:trPr>
+        <w:tc>
+          <w:tcPr>
+            <w:tcW w:w="8926" w:type="dxa"/>
+            <w:gridSpan w:val="2"/>
+          </w:tcPr>
+          <w:p>
+            <w:pPr>
+              <w:spacing w:before="240" w:after="0" w:line="240" w:lineRule="auto"/>
+              <w:ind w:left="0" w:right="170" w:firstLine="0"/>
+              <w:rPr>
+                <w:rFonts w:asciiTheme="minorHAnsi" w:hAnsiTheme="minorHAnsi" w:cstheme="minorHAnsi"/>
+              </w:rPr>
+            </w:pPr>
+            <w:r>
+              <w:rPr>
+                <w:rFonts w:asciiTheme="minorHAnsi" w:hAnsiTheme="minorHAnsi" w:cstheme="minorHAnsi"/>
+              </w:rPr>
+              <w:fldChar w:fldCharType="begin"/>
+            </w:r>
+            <w:r>
+              <w:rPr>
+                <w:rFonts w:asciiTheme="minorHAnsi" w:hAnsiTheme="minorHAnsi" w:cstheme="minorHAnsi"/>
+              </w:rPr>
+              <w:instrText xml:space="preserve"> MERGEFIELD  "#if($privacyPolicyParams) 3.    Nuestra Política de Privacidad.#end"  \* MERGEFORMAT </w:instrText>
+            </w:r>
+            <w:r>
+              <w:rPr>
+                <w:rFonts w:asciiTheme="minorHAnsi" w:hAnsiTheme="minorHAnsi" w:cstheme="minorHAnsi"/>
+              </w:rPr>
+              <w:fldChar w:fldCharType="separate"/>
+            </w:r>
+            <w:r>
+              <w:rPr>
+                <w:rFonts w:asciiTheme="minorHAnsi" w:hAnsiTheme="minorHAnsi" w:cstheme="minorHAnsi"/>
+                <w:noProof/>
+              </w:rPr>
+              <w:t>«#if($privacyPolicyParams) 3.    Nuestra</w:t>
+            </w:r>
+            <w:r>
+              <w:rPr>
+                <w:rFonts w:asciiTheme="minorHAnsi" w:hAnsiTheme="minorHAnsi" w:cstheme="minorHAnsi"/>
+                <w:noProof/>
+              </w:rPr>
+              <w:t xml:space="preserve"> </w:t>
+            </w:r>
+            <w:r>
+              <w:rPr>
+                <w:rFonts w:asciiTheme="minorHAnsi" w:hAnsiTheme="minorHAnsi" w:cstheme="minorHAnsi"/>
+                <w:noProof/>
+              </w:rPr>
+              <w:t xml:space="preserve"> »</w:t>
+            </w:r>
+            <w:r>
+              <w:rPr>
+                <w:rFonts w:asciiTheme="minorHAnsi" w:hAnsiTheme="minorHAnsi" w:cstheme="minorHAnsi"/>
+              </w:rPr>
+              <w:fldChar w:fldCharType="end"/>
+            </w:r>
+          </w:p>
+        </w:tc>
+      </w:tr>
+      <w:tr>
+        <w:tc>
+          <w:tcPr>
+            <w:tcW w:w="384" w:type="dxa"/>
+          </w:tcPr>
+          <w:p>
+            <w:pPr>
+              <w:spacing w:before="240" w:after="0" w:line="240" w:lineRule="auto"/>
+              <w:ind w:left="0" w:right="-435" w:firstLine="0"/>
+              <w:rPr>
+                <w:rFonts w:asciiTheme="minorHAnsi" w:hAnsiTheme="minorHAnsi" w:cstheme="minorHAnsi"/>
+              </w:rPr>
+            </w:pPr>
+          </w:p>
+        </w:tc>
+        <w:tc>
+          <w:tcPr>
+            <w:tcW w:w="8542" w:type="dxa"/>
+          </w:tcPr>
+          <w:p>
+            <w:pPr>
+              <w:spacing w:before="240" w:after="0" w:line="240" w:lineRule="auto"/>
+              <w:ind w:left="0" w:right="170" w:firstLine="0"/>
+              <w:rPr>
+                <w:rFonts w:asciiTheme="minorHAnsi" w:hAnsiTheme="minorHAnsi" w:cstheme="minorHAnsi"/>
+              </w:rPr>
+            </w:pPr>
+            <w:r>
+              <w:rPr>
+                <w:rFonts w:asciiTheme="minorHAnsi" w:hAnsiTheme="minorHAnsi" w:cstheme="minorHAnsi"/>
+              </w:rPr>
+              <w:fldChar w:fldCharType="begin"/>
+            </w:r>
+            <w:r>
+              <w:rPr>
+                <w:rFonts w:asciiTheme="minorHAnsi" w:hAnsiTheme="minorHAnsi" w:cstheme="minorHAnsi"/>
+              </w:rPr>
+              <w:instrText xml:space="preserve"> MERGEFIELD  "#if($privacyPolicyParams)De acuerdo con los datos que figuran en nuestra Base de Datos, el cliente/a Sr./a $fullName ofreció su aceptación electrónica#end"  \* MERGEFORMAT </w:instrText>
+            </w:r>
+            <w:r>
+              <w:rPr>
+                <w:rFonts w:asciiTheme="minorHAnsi" w:hAnsiTheme="minorHAnsi" w:cstheme="minorHAnsi"/>
+              </w:rPr>
+              <w:fldChar w:fldCharType="separate"/>
+            </w:r>
+            <w:r>
+              <w:rPr>
+                <w:rFonts w:asciiTheme="minorHAnsi" w:hAnsiTheme="minorHAnsi" w:cstheme="minorHAnsi"/>
+                <w:noProof/>
+              </w:rPr>
+              <w:t>«#if($privacyPolicyParams)De acuerdo con »</w:t>
+            </w:r>
+            <w:r>
+              <w:rPr>
+                <w:rFonts w:asciiTheme="minorHAnsi" w:hAnsiTheme="minorHAnsi" w:cstheme="minorHAnsi"/>
+              </w:rPr>
+              <w:fldChar w:fldCharType="end"/>
+            </w:r>
+            <w:r>
+              <w:rPr>
+                <w:rFonts w:asciiTheme="minorHAnsi" w:hAnsiTheme="minorHAnsi" w:cstheme="minorHAnsi"/>
+              </w:rPr>
+              <w:t xml:space="preserve"> </w:t>
+            </w:r>
+            <w:r>
+              <w:rPr>
+                <w:rFonts w:asciiTheme="minorHAnsi" w:hAnsiTheme="minorHAnsi" w:cstheme="minorHAnsi"/>
+              </w:rPr>
+              <w:fldChar w:fldCharType="begin"/>
+            </w:r>
+            <w:r>
+              <w:rPr>
+                <w:rFonts w:asciiTheme="minorHAnsi" w:hAnsiTheme="minorHAnsi" w:cstheme="minorHAnsi"/>
+              </w:rPr>
+              <w:instrText xml:space="preserve"> MERGEFIELD  "#if($privacyPolicyParams) el pasado día $privacyPolicyParams.formattedDate a las $privacyPolicyParams.hour#if($privacyPolicyParams.ip) desde la IP $privacyPolicyParams.ip#end.#end"  \* MERGEFORMAT </w:instrText>
+            </w:r>
+            <w:r>
+              <w:rPr>
+                <w:rFonts w:asciiTheme="minorHAnsi" w:hAnsiTheme="minorHAnsi" w:cstheme="minorHAnsi"/>
+              </w:rPr>
+              <w:fldChar w:fldCharType="separate"/>
+            </w:r>
+            <w:r>
+              <w:rPr>
+                <w:rFonts w:asciiTheme="minorHAnsi" w:hAnsiTheme="minorHAnsi" w:cstheme="minorHAnsi"/>
+                <w:noProof/>
+              </w:rPr>
+              <w:t>«#if($privacyPolicyParams) el pasado día »</w:t>
+            </w:r>
+            <w:r>
+              <w:rPr>
+                <w:rFonts w:asciiTheme="minorHAnsi" w:hAnsiTheme="minorHAnsi" w:cstheme="minorHAnsi"/>
+              </w:rPr>
+              <w:fldChar w:fldCharType="end"/>
+            </w:r>
+          </w:p>
+        </w:tc>
+      </w:tr>
+    </w:tbl>
     <w:p>
       <w:pPr>
-        <w:pStyle w:val="a8"/>
-        <w:numPr>
-          <w:ilvl w:val="0"/>
-          <w:numId w:val="2"/>
-        </w:numPr>
         <w:spacing w:after="0" w:line="240" w:lineRule="auto"/>
-        <w:ind w:left="426" w:right="0" w:hanging="426"/>
-        <w:rPr>
-          <w:rFonts w:asciiTheme="minorHAnsi" w:hAnsiTheme="minorHAnsi" w:cstheme="minorHAnsi"/>
-        </w:rPr>
-      </w:pPr>
-      <w:r>
-        <w:rPr>
-          <w:rFonts w:asciiTheme="minorHAnsi" w:hAnsiTheme="minorHAnsi" w:cstheme="minorHAnsi"/>
-        </w:rPr>
-        <w:t>Los Términos y Condiciones Particulares y Generales del referido contrato de préstamo.</w:t>
-      </w:r>
-    </w:p>
-    <w:p>
-      <w:pPr>
-        <w:pStyle w:val="a8"/>
-        <w:spacing w:after="0" w:line="240" w:lineRule="auto"/>
-        <w:ind w:left="426" w:right="0" w:firstLine="0"/>
-        <w:rPr>
-          <w:rFonts w:asciiTheme="minorHAnsi" w:hAnsiTheme="minorHAnsi" w:cstheme="minorHAnsi"/>
-        </w:rPr>
-      </w:pPr>
-    </w:p>
-    <w:p>
-      <w:pPr>
-        <w:pStyle w:val="a8"/>
-        <w:spacing w:after="0" w:line="240" w:lineRule="auto"/>
-        <w:ind w:left="426" w:right="0" w:firstLine="0"/>
-        <w:rPr>
-          <w:rFonts w:asciiTheme="minorHAnsi" w:hAnsiTheme="minorHAnsi" w:cstheme="minorHAnsi"/>
-          <w:color w:val="auto"/>
-        </w:rPr>
-      </w:pPr>
-      <w:r>
-        <w:rPr>
-          <w:rFonts w:asciiTheme="minorHAnsi" w:hAnsiTheme="minorHAnsi" w:cstheme="minorHAnsi"/>
-        </w:rPr>
-        <w:t xml:space="preserve">De acuerdo con los datos que figuran en nuestra Base de Datos, el cliente/a Sr./a </w:t>
-      </w:r>
-      <w:r>
-        <w:rPr>
-          <w:rFonts w:asciiTheme="minorHAnsi" w:hAnsiTheme="minorHAnsi" w:cstheme="minorHAnsi"/>
-        </w:rPr>
-        <w:fldChar w:fldCharType="begin"/>
-      </w:r>
-      <w:r>
-        <w:rPr>
-          <w:rFonts w:asciiTheme="minorHAnsi" w:hAnsiTheme="minorHAnsi" w:cstheme="minorHAnsi"/>
-        </w:rPr>
-        <w:instrText xml:space="preserve"> MERGEFIELD  $borrower.fullName  \* MERGEFORMAT </w:instrText>
-      </w:r>
-      <w:r>
-        <w:rPr>
-          <w:rFonts w:asciiTheme="minorHAnsi" w:hAnsiTheme="minorHAnsi" w:cstheme="minorHAnsi"/>
-        </w:rPr>
-        <w:fldChar w:fldCharType="separate"/>
-      </w:r>
-      <w:r>
-        <w:rPr>
-          <w:rFonts w:asciiTheme="minorHAnsi" w:hAnsiTheme="minorHAnsi" w:cstheme="minorHAnsi"/>
-          <w:noProof/>
-        </w:rPr>
-        <w:t>«$borrower.fullName»</w:t>
-      </w:r>
-      <w:r>
-        <w:rPr>
-          <w:rFonts w:asciiTheme="minorHAnsi" w:hAnsiTheme="minorHAnsi" w:cstheme="minorHAnsi"/>
-        </w:rPr>
-        <w:fldChar w:fldCharType="end"/>
-      </w:r>
-      <w:r>
-        <w:rPr>
-          <w:rFonts w:asciiTheme="minorHAnsi" w:hAnsiTheme="minorHAnsi" w:cstheme="minorHAnsi"/>
-        </w:rPr>
-        <w:t xml:space="preserve"> </w:t>
-      </w:r>
-      <w:r>
-        <w:rPr>
-          <w:rFonts w:asciiTheme="minorHAnsi" w:hAnsiTheme="minorHAnsi" w:cstheme="minorHAnsi"/>
-        </w:rPr>
-        <w:t xml:space="preserve">ofreció su aceptación electrónica el pasado día </w:t>
-      </w:r>
-      <w:r>
-        <w:rPr>
-          <w:rFonts w:asciiTheme="minorHAnsi" w:hAnsiTheme="minorHAnsi" w:cstheme="minorHAnsi"/>
-        </w:rPr>
-        <w:fldChar w:fldCharType="begin"/>
-      </w:r>
-      <w:r>
-        <w:rPr>
-          <w:rFonts w:asciiTheme="minorHAnsi" w:hAnsiTheme="minorHAnsi" w:cstheme="minorHAnsi"/>
-        </w:rPr>
-        <w:instrText xml:space="preserve"> MERGEFIELD  $agreementDateTC  \* MERGEFORMAT </w:instrText>
-      </w:r>
-      <w:r>
-        <w:rPr>
-          <w:rFonts w:asciiTheme="minorHAnsi" w:hAnsiTheme="minorHAnsi" w:cstheme="minorHAnsi"/>
-        </w:rPr>
-        <w:fldChar w:fldCharType="separate"/>
-      </w:r>
-      <w:r>
-        <w:rPr>
-          <w:rFonts w:asciiTheme="minorHAnsi" w:hAnsiTheme="minorHAnsi" w:cstheme="minorHAnsi"/>
-          <w:noProof/>
-        </w:rPr>
-        <w:t>«$agreementDateTC»</w:t>
-      </w:r>
-      <w:r>
-        <w:rPr>
-          <w:rFonts w:asciiTheme="minorHAnsi" w:hAnsiTheme="minorHAnsi" w:cstheme="minorHAnsi"/>
-        </w:rPr>
-        <w:fldChar w:fldCharType="end"/>
-      </w:r>
-      <w:r>
-        <w:rPr>
-          <w:rFonts w:asciiTheme="minorHAnsi" w:hAnsiTheme="minorHAnsi" w:cstheme="minorHAnsi"/>
-        </w:rPr>
-        <w:t xml:space="preserve"> </w:t>
-      </w:r>
-      <w:r>
-        <w:rPr>
-          <w:rFonts w:asciiTheme="minorHAnsi" w:hAnsiTheme="minorHAnsi" w:cstheme="minorHAnsi"/>
-        </w:rPr>
-        <w:t xml:space="preserve">a las </w:t>
-      </w:r>
-      <w:r>
-        <w:rPr>
-          <w:rFonts w:asciiTheme="minorHAnsi" w:hAnsiTheme="minorHAnsi" w:cstheme="minorHAnsi"/>
-        </w:rPr>
-        <w:fldChar w:fldCharType="begin"/>
-      </w:r>
-      <w:r>
-        <w:rPr>
-          <w:rFonts w:asciiTheme="minorHAnsi" w:hAnsiTheme="minorHAnsi" w:cstheme="minorHAnsi"/>
-        </w:rPr>
-        <w:instrText xml:space="preserve"> MERGEFIELD  $agreementHourTC  \* MERGEFORMAT </w:instrText>
-      </w:r>
-      <w:r>
-        <w:rPr>
-          <w:rFonts w:asciiTheme="minorHAnsi" w:hAnsiTheme="minorHAnsi" w:cstheme="minorHAnsi"/>
-        </w:rPr>
-        <w:fldChar w:fldCharType="separate"/>
-      </w:r>
-      <w:r>
-        <w:rPr>
-          <w:rFonts w:asciiTheme="minorHAnsi" w:hAnsiTheme="minorHAnsi" w:cstheme="minorHAnsi"/>
-          <w:noProof/>
-        </w:rPr>
-        <w:t>«$agreementHourTC»</w:t>
-      </w:r>
-      <w:r>
-        <w:rPr>
-          <w:rFonts w:asciiTheme="minorHAnsi" w:hAnsiTheme="minorHAnsi" w:cstheme="minorHAnsi"/>
-        </w:rPr>
-        <w:fldChar w:fldCharType="end"/>
-      </w:r>
-      <w:r>
-        <w:rPr>
-          <w:rFonts w:asciiTheme="minorHAnsi" w:hAnsiTheme="minorHAnsi" w:cstheme="minorHAnsi"/>
-        </w:rPr>
-        <w:t xml:space="preserve"> </w:t>
-      </w:r>
-      <w:r>
-        <w:rPr>
-          <w:rFonts w:asciiTheme="minorHAnsi" w:hAnsiTheme="minorHAnsi" w:cstheme="minorHAnsi"/>
-        </w:rPr>
-        <w:t>desde la IP</w:t>
-      </w:r>
-      <w:r>
-        <w:rPr>
-          <w:rFonts w:asciiTheme="minorHAnsi" w:hAnsiTheme="minorHAnsi" w:cstheme="minorHAnsi"/>
-        </w:rPr>
-        <w:t xml:space="preserve"> </w:t>
-      </w:r>
-      <w:r>
-        <w:rPr>
-          <w:rFonts w:asciiTheme="minorHAnsi" w:hAnsiTheme="minorHAnsi" w:cstheme="minorHAnsi"/>
-        </w:rPr>
-        <w:fldChar w:fldCharType="begin"/>
-      </w:r>
-      <w:r>
-        <w:rPr>
-          <w:rFonts w:asciiTheme="minorHAnsi" w:hAnsiTheme="minorHAnsi" w:cstheme="minorHAnsi"/>
-        </w:rPr>
-        <w:instrText xml:space="preserve"> MERGEFIELD  $borrower.IP.addressTC  \* MERGEFORMAT </w:instrText>
-      </w:r>
-      <w:r>
-        <w:rPr>
-          <w:rFonts w:asciiTheme="minorHAnsi" w:hAnsiTheme="minorHAnsi" w:cstheme="minorHAnsi"/>
-        </w:rPr>
-        <w:fldChar w:fldCharType="separate"/>
-      </w:r>
-      <w:r>
-        <w:rPr>
-          <w:rFonts w:asciiTheme="minorHAnsi" w:hAnsiTheme="minorHAnsi" w:cstheme="minorHAnsi"/>
-          <w:noProof/>
-        </w:rPr>
-        <w:t>«$borrower.IP.addressTC»</w:t>
-      </w:r>
-      <w:r>
-        <w:rPr>
-          <w:rFonts w:asciiTheme="minorHAnsi" w:hAnsiTheme="minorHAnsi" w:cstheme="minorHAnsi"/>
-        </w:rPr>
-        <w:fldChar w:fldCharType="end"/>
-      </w:r>
-      <w:r>
-        <w:rPr>
-          <w:rFonts w:asciiTheme="minorHAnsi" w:hAnsiTheme="minorHAnsi" w:cstheme="minorHAnsi"/>
-        </w:rPr>
-        <w:t>.</w:t>
-      </w:r>
-    </w:p>
-    <w:p>
-      <w:pPr>
-        <w:pStyle w:val="a8"/>
-        <w:spacing w:after="0" w:line="240" w:lineRule="auto"/>
-        <w:ind w:left="426" w:right="0" w:firstLine="0"/>
-        <w:rPr>
-          <w:rFonts w:asciiTheme="minorHAnsi" w:hAnsiTheme="minorHAnsi" w:cstheme="minorHAnsi"/>
-        </w:rPr>
-      </w:pPr>
-    </w:p>
-    <w:p>
-      <w:pPr>
-        <w:pStyle w:val="a8"/>
-        <w:numPr>
-          <w:ilvl w:val="0"/>
-          <w:numId w:val="2"/>
-        </w:numPr>
-        <w:spacing w:after="0" w:line="240" w:lineRule="auto"/>
-        <w:ind w:left="426" w:right="0" w:hanging="425"/>
-        <w:rPr>
-          <w:rFonts w:asciiTheme="minorHAnsi" w:hAnsiTheme="minorHAnsi" w:cstheme="minorHAnsi"/>
-        </w:rPr>
-      </w:pPr>
-      <w:r>
-        <w:rPr>
-          <w:rFonts w:asciiTheme="minorHAnsi" w:hAnsiTheme="minorHAnsi" w:cstheme="minorHAnsi"/>
-        </w:rPr>
-        <w:t>El Formulario de Información Normalizada Europea (INE) sobre crédito al consumo del referido contrato de préstamo.</w:t>
-      </w:r>
-    </w:p>
-    <w:p>
-      <w:pPr>
-        <w:pStyle w:val="a8"/>
-        <w:spacing w:after="0" w:line="240" w:lineRule="auto"/>
-        <w:ind w:left="426" w:right="0" w:firstLine="0"/>
-        <w:jc w:val="left"/>
-        <w:rPr>
-          <w:rFonts w:asciiTheme="minorHAnsi" w:hAnsiTheme="minorHAnsi" w:cstheme="minorHAnsi"/>
-        </w:rPr>
-      </w:pPr>
-    </w:p>
-    <w:p>
-      <w:pPr>
-        <w:pStyle w:val="a8"/>
-        <w:spacing w:after="0" w:line="240" w:lineRule="auto"/>
-        <w:ind w:left="426" w:right="0" w:firstLine="0"/>
-        <w:rPr>
-          <w:rFonts w:asciiTheme="minorHAnsi" w:hAnsiTheme="minorHAnsi" w:cstheme="minorHAnsi"/>
-        </w:rPr>
-      </w:pPr>
-      <w:r>
-        <w:rPr>
-          <w:rFonts w:asciiTheme="minorHAnsi" w:hAnsiTheme="minorHAnsi" w:cstheme="minorHAnsi"/>
-        </w:rPr>
-        <w:t xml:space="preserve">De acuerdo con los datos que figuran en nuestra Base de Datos, el cliente/a Sr./a </w:t>
-      </w:r>
-      <w:r>
-        <w:rPr>
-          <w:rFonts w:asciiTheme="minorHAnsi" w:hAnsiTheme="minorHAnsi" w:cstheme="minorHAnsi"/>
-        </w:rPr>
-        <w:fldChar w:fldCharType="begin"/>
-      </w:r>
-      <w:r>
-        <w:rPr>
-          <w:rFonts w:asciiTheme="minorHAnsi" w:hAnsiTheme="minorHAnsi" w:cstheme="minorHAnsi"/>
-        </w:rPr>
-        <w:instrText xml:space="preserve"> MERGEFIELD  $borrower.fullName  \* MERGEFORMAT </w:instrText>
-      </w:r>
-      <w:r>
-        <w:rPr>
-          <w:rFonts w:asciiTheme="minorHAnsi" w:hAnsiTheme="minorHAnsi" w:cstheme="minorHAnsi"/>
-        </w:rPr>
-        <w:fldChar w:fldCharType="separate"/>
-      </w:r>
-      <w:r>
-        <w:rPr>
-          <w:rFonts w:asciiTheme="minorHAnsi" w:hAnsiTheme="minorHAnsi" w:cstheme="minorHAnsi"/>
-          <w:noProof/>
-        </w:rPr>
-        <w:t>«$borrower.fullName»</w:t>
-      </w:r>
-      <w:r>
-        <w:rPr>
-          <w:rFonts w:asciiTheme="minorHAnsi" w:hAnsiTheme="minorHAnsi" w:cstheme="minorHAnsi"/>
-        </w:rPr>
-        <w:fldChar w:fldCharType="end"/>
-      </w:r>
-      <w:r>
-        <w:rPr>
-          <w:rFonts w:asciiTheme="minorHAnsi" w:hAnsiTheme="minorHAnsi" w:cstheme="minorHAnsi"/>
-        </w:rPr>
-        <w:t xml:space="preserve"> </w:t>
-      </w:r>
-      <w:r>
-        <w:rPr>
-          <w:rFonts w:asciiTheme="minorHAnsi" w:hAnsiTheme="minorHAnsi" w:cstheme="minorHAnsi"/>
-        </w:rPr>
-        <w:t xml:space="preserve">ofreció su aceptación electrónica el pasado día </w:t>
-      </w:r>
-      <w:r>
-        <w:rPr>
-          <w:rFonts w:asciiTheme="minorHAnsi" w:hAnsiTheme="minorHAnsi" w:cstheme="minorHAnsi"/>
-        </w:rPr>
-        <w:fldChar w:fldCharType="begin"/>
-      </w:r>
-      <w:r>
-        <w:rPr>
-          <w:rFonts w:asciiTheme="minorHAnsi" w:hAnsiTheme="minorHAnsi" w:cstheme="minorHAnsi"/>
-        </w:rPr>
-        <w:instrText xml:space="preserve"> MERGEFIELD  $agreementDatePC  \* MERGEFORMAT </w:instrText>
-      </w:r>
-      <w:r>
-        <w:rPr>
-          <w:rFonts w:asciiTheme="minorHAnsi" w:hAnsiTheme="minorHAnsi" w:cstheme="minorHAnsi"/>
-        </w:rPr>
-        <w:fldChar w:fldCharType="separate"/>
-      </w:r>
-      <w:r>
-        <w:rPr>
-          <w:rFonts w:asciiTheme="minorHAnsi" w:hAnsiTheme="minorHAnsi" w:cstheme="minorHAnsi"/>
-          <w:noProof/>
-        </w:rPr>
-        <w:t>«$agreementDatePC»</w:t>
-      </w:r>
-      <w:r>
-        <w:rPr>
-          <w:rFonts w:asciiTheme="minorHAnsi" w:hAnsiTheme="minorHAnsi" w:cstheme="minorHAnsi"/>
-        </w:rPr>
-        <w:fldChar w:fldCharType="end"/>
-      </w:r>
-      <w:r>
-        <w:rPr>
-          <w:rFonts w:asciiTheme="minorHAnsi" w:hAnsiTheme="minorHAnsi" w:cstheme="minorHAnsi"/>
-        </w:rPr>
-        <w:t xml:space="preserve"> </w:t>
-      </w:r>
-      <w:r>
-        <w:rPr>
-          <w:rFonts w:asciiTheme="minorHAnsi" w:hAnsiTheme="minorHAnsi" w:cstheme="minorHAnsi"/>
-        </w:rPr>
-        <w:t xml:space="preserve">a las </w:t>
-      </w:r>
-      <w:r>
-        <w:rPr>
-          <w:rFonts w:asciiTheme="minorHAnsi" w:hAnsiTheme="minorHAnsi" w:cstheme="minorHAnsi"/>
-        </w:rPr>
-        <w:fldChar w:fldCharType="begin"/>
-      </w:r>
-      <w:r>
-        <w:rPr>
-          <w:rFonts w:asciiTheme="minorHAnsi" w:hAnsiTheme="minorHAnsi" w:cstheme="minorHAnsi"/>
-        </w:rPr>
-        <w:instrText xml:space="preserve"> MERGEFIELD  $agreementDatePC  \* MERGEFORMAT </w:instrText>
-      </w:r>
-      <w:r>
-        <w:rPr>
-          <w:rFonts w:asciiTheme="minorHAnsi" w:hAnsiTheme="minorHAnsi" w:cstheme="minorHAnsi"/>
-        </w:rPr>
-        <w:fldChar w:fldCharType="separate"/>
-      </w:r>
-      <w:r>
-        <w:rPr>
-          <w:rFonts w:asciiTheme="minorHAnsi" w:hAnsiTheme="minorHAnsi" w:cstheme="minorHAnsi"/>
-          <w:noProof/>
-        </w:rPr>
-        <w:t>«$agreementDatePC»</w:t>
-      </w:r>
-      <w:r>
-        <w:rPr>
-          <w:rFonts w:asciiTheme="minorHAnsi" w:hAnsiTheme="minorHAnsi" w:cstheme="minorHAnsi"/>
-        </w:rPr>
-        <w:fldChar w:fldCharType="end"/>
-      </w:r>
-      <w:r>
-        <w:rPr>
-          <w:rFonts w:asciiTheme="minorHAnsi" w:hAnsiTheme="minorHAnsi" w:cstheme="minorHAnsi"/>
-        </w:rPr>
-        <w:t xml:space="preserve"> </w:t>
-      </w:r>
-      <w:r>
-        <w:rPr>
-          <w:rFonts w:asciiTheme="minorHAnsi" w:hAnsiTheme="minorHAnsi" w:cstheme="minorHAnsi"/>
-        </w:rPr>
-        <w:t>desde la IP</w:t>
-      </w:r>
-      <w:r>
-        <w:rPr>
-          <w:rFonts w:asciiTheme="minorHAnsi" w:hAnsiTheme="minorHAnsi" w:cstheme="minorHAnsi"/>
-        </w:rPr>
-        <w:t xml:space="preserve"> </w:t>
-      </w:r>
-      <w:r>
-        <w:rPr>
-          <w:rFonts w:asciiTheme="minorHAnsi" w:hAnsiTheme="minorHAnsi" w:cstheme="minorHAnsi"/>
-        </w:rPr>
-        <w:fldChar w:fldCharType="begin"/>
-      </w:r>
-      <w:r>
-        <w:rPr>
-          <w:rFonts w:asciiTheme="minorHAnsi" w:hAnsiTheme="minorHAnsi" w:cstheme="minorHAnsi"/>
-        </w:rPr>
-        <w:instrText xml:space="preserve"> MERGEFIELD  $borrower.IP.addressPC  \* MERGEFORMAT </w:instrText>
-      </w:r>
-      <w:r>
-        <w:rPr>
-          <w:rFonts w:asciiTheme="minorHAnsi" w:hAnsiTheme="minorHAnsi" w:cstheme="minorHAnsi"/>
-        </w:rPr>
-        <w:fldChar w:fldCharType="separate"/>
-      </w:r>
-      <w:r>
-        <w:rPr>
-          <w:rFonts w:asciiTheme="minorHAnsi" w:hAnsiTheme="minorHAnsi" w:cstheme="minorHAnsi"/>
-          <w:noProof/>
-        </w:rPr>
-        <w:t>«$borrower.IP.addressPC»</w:t>
-      </w:r>
-      <w:r>
-        <w:rPr>
-          <w:rFonts w:asciiTheme="minorHAnsi" w:hAnsiTheme="minorHAnsi" w:cstheme="minorHAnsi"/>
-        </w:rPr>
-        <w:fldChar w:fldCharType="end"/>
-      </w:r>
-      <w:r>
-        <w:rPr>
-          <w:rFonts w:asciiTheme="minorHAnsi" w:hAnsiTheme="minorHAnsi" w:cstheme="minorHAnsi"/>
-        </w:rPr>
-        <w:t>.</w:t>
-      </w:r>
-    </w:p>
-    <w:p>
-      <w:pPr>
-        <w:pStyle w:val="a8"/>
-        <w:spacing w:after="0" w:line="240" w:lineRule="auto"/>
-        <w:ind w:left="426" w:right="0" w:firstLine="0"/>
-        <w:rPr>
-          <w:rFonts w:asciiTheme="minorHAnsi" w:hAnsiTheme="minorHAnsi" w:cstheme="minorHAnsi"/>
-        </w:rPr>
-      </w:pPr>
-    </w:p>
-    <w:p>
-      <w:pPr>
-        <w:pStyle w:val="a8"/>
-        <w:numPr>
-          <w:ilvl w:val="0"/>
-          <w:numId w:val="2"/>
-        </w:numPr>
-        <w:spacing w:after="0" w:line="240" w:lineRule="auto"/>
-        <w:ind w:left="426" w:right="0" w:hanging="426"/>
-        <w:rPr>
-          <w:rFonts w:asciiTheme="minorHAnsi" w:hAnsiTheme="minorHAnsi" w:cstheme="minorHAnsi"/>
-        </w:rPr>
-      </w:pPr>
-      <w:r>
-        <w:rPr>
-          <w:rFonts w:asciiTheme="minorHAnsi" w:hAnsiTheme="minorHAnsi" w:cstheme="minorHAnsi"/>
-        </w:rPr>
-        <w:t>Nuestra Política de Privacidad.</w:t>
-      </w:r>
-    </w:p>
-    <w:p>
-      <w:pPr>
-        <w:pStyle w:val="a8"/>
-        <w:spacing w:after="0" w:line="240" w:lineRule="auto"/>
-        <w:ind w:left="426" w:right="0" w:firstLine="0"/>
-        <w:jc w:val="left"/>
-        <w:rPr>
-          <w:rFonts w:asciiTheme="minorHAnsi" w:hAnsiTheme="minorHAnsi" w:cstheme="minorHAnsi"/>
-        </w:rPr>
-      </w:pPr>
-    </w:p>
-    <w:p>
-      <w:pPr>
-        <w:pStyle w:val="a8"/>
-        <w:spacing w:after="0" w:line="240" w:lineRule="auto"/>
-        <w:ind w:left="426" w:right="0" w:firstLine="0"/>
-        <w:rPr>
-          <w:rFonts w:asciiTheme="minorHAnsi" w:hAnsiTheme="minorHAnsi" w:cstheme="minorHAnsi"/>
-        </w:rPr>
-      </w:pPr>
-      <w:r>
-        <w:rPr>
-          <w:rFonts w:asciiTheme="minorHAnsi" w:hAnsiTheme="minorHAnsi" w:cstheme="minorHAnsi"/>
-        </w:rPr>
-        <w:t xml:space="preserve">De acuerdo con los datos que figuran en nuestra Base de Datos, el cliente/a Sr./a </w:t>
-      </w:r>
-      <w:r>
-        <w:rPr>
-          <w:rFonts w:asciiTheme="minorHAnsi" w:hAnsiTheme="minorHAnsi" w:cstheme="minorHAnsi"/>
-        </w:rPr>
-        <w:fldChar w:fldCharType="begin"/>
-      </w:r>
-      <w:r>
-        <w:rPr>
-          <w:rFonts w:asciiTheme="minorHAnsi" w:hAnsiTheme="minorHAnsi" w:cstheme="minorHAnsi"/>
-        </w:rPr>
-        <w:instrText xml:space="preserve"> MERGEFIELD  $borrower.fullName  \* MERGEFORMAT </w:instrText>
-      </w:r>
-      <w:r>
-        <w:rPr>
-          <w:rFonts w:asciiTheme="minorHAnsi" w:hAnsiTheme="minorHAnsi" w:cstheme="minorHAnsi"/>
-        </w:rPr>
-        <w:fldChar w:fldCharType="separate"/>
-      </w:r>
-      <w:r>
-        <w:rPr>
-          <w:rFonts w:asciiTheme="minorHAnsi" w:hAnsiTheme="minorHAnsi" w:cstheme="minorHAnsi"/>
-          <w:noProof/>
-        </w:rPr>
-        <w:t>«$borrower.fullName»</w:t>
-      </w:r>
-      <w:r>
-        <w:rPr>
-          <w:rFonts w:asciiTheme="minorHAnsi" w:hAnsiTheme="minorHAnsi" w:cstheme="minorHAnsi"/>
-        </w:rPr>
-        <w:fldChar w:fldCharType="end"/>
-      </w:r>
-      <w:r>
-        <w:rPr>
-          <w:rFonts w:asciiTheme="minorHAnsi" w:hAnsiTheme="minorHAnsi" w:cstheme="minorHAnsi"/>
-        </w:rPr>
-        <w:t xml:space="preserve"> </w:t>
-      </w:r>
-      <w:r>
-        <w:rPr>
-          <w:rFonts w:asciiTheme="minorHAnsi" w:hAnsiTheme="minorHAnsi" w:cstheme="minorHAnsi"/>
-        </w:rPr>
-        <w:t xml:space="preserve">ofreció su aceptación electrónica el pasado día </w:t>
-      </w:r>
-      <w:r>
-        <w:rPr>
-          <w:rFonts w:asciiTheme="minorHAnsi" w:hAnsiTheme="minorHAnsi" w:cstheme="minorHAnsi"/>
-        </w:rPr>
-        <w:fldChar w:fldCharType="begin"/>
-      </w:r>
-      <w:r>
-        <w:rPr>
-          <w:rFonts w:asciiTheme="minorHAnsi" w:hAnsiTheme="minorHAnsi" w:cstheme="minorHAnsi"/>
-        </w:rPr>
-        <w:instrText xml:space="preserve"> MERGEFIELD  $agreementDatePP  \* MERGEFORMAT </w:instrText>
-      </w:r>
-      <w:r>
-        <w:rPr>
-          <w:rFonts w:asciiTheme="minorHAnsi" w:hAnsiTheme="minorHAnsi" w:cstheme="minorHAnsi"/>
-        </w:rPr>
-        <w:fldChar w:fldCharType="separate"/>
-      </w:r>
-      <w:r>
-        <w:rPr>
-          <w:rFonts w:asciiTheme="minorHAnsi" w:hAnsiTheme="minorHAnsi" w:cstheme="minorHAnsi"/>
-          <w:noProof/>
-        </w:rPr>
-        <w:t>«$agreementDatePP»</w:t>
-      </w:r>
-      <w:r>
-        <w:rPr>
-          <w:rFonts w:asciiTheme="minorHAnsi" w:hAnsiTheme="minorHAnsi" w:cstheme="minorHAnsi"/>
-        </w:rPr>
-        <w:fldChar w:fldCharType="end"/>
-      </w:r>
-      <w:r>
-        <w:rPr>
-          <w:rFonts w:asciiTheme="minorHAnsi" w:hAnsiTheme="minorHAnsi" w:cstheme="minorHAnsi"/>
-        </w:rPr>
-        <w:t xml:space="preserve"> </w:t>
-      </w:r>
-      <w:r>
-        <w:rPr>
-          <w:rFonts w:asciiTheme="minorHAnsi" w:hAnsiTheme="minorHAnsi" w:cstheme="minorHAnsi"/>
-        </w:rPr>
-        <w:t xml:space="preserve">a las </w:t>
-      </w:r>
-      <w:r>
-        <w:rPr>
-          <w:rFonts w:asciiTheme="minorHAnsi" w:hAnsiTheme="minorHAnsi" w:cstheme="minorHAnsi"/>
-        </w:rPr>
-        <w:fldChar w:fldCharType="begin"/>
-      </w:r>
-      <w:r>
-        <w:rPr>
-          <w:rFonts w:asciiTheme="minorHAnsi" w:hAnsiTheme="minorHAnsi" w:cstheme="minorHAnsi"/>
-        </w:rPr>
-        <w:instrText xml:space="preserve"> MERGEFIELD  $agreementHourPP  \* MERGEFORMAT </w:instrText>
-      </w:r>
-      <w:r>
-        <w:rPr>
-          <w:rFonts w:asciiTheme="minorHAnsi" w:hAnsiTheme="minorHAnsi" w:cstheme="minorHAnsi"/>
-        </w:rPr>
-        <w:fldChar w:fldCharType="separate"/>
-      </w:r>
-      <w:r>
-        <w:rPr>
-          <w:rFonts w:asciiTheme="minorHAnsi" w:hAnsiTheme="minorHAnsi" w:cstheme="minorHAnsi"/>
-          <w:noProof/>
-        </w:rPr>
-        <w:t>«$agreementHourPP»</w:t>
-      </w:r>
-      <w:r>
-        <w:rPr>
-          <w:rFonts w:asciiTheme="minorHAnsi" w:hAnsiTheme="minorHAnsi" w:cstheme="minorHAnsi"/>
-        </w:rPr>
-        <w:fldChar w:fldCharType="end"/>
-      </w:r>
-      <w:r>
-        <w:rPr>
-          <w:rFonts w:asciiTheme="minorHAnsi" w:hAnsiTheme="minorHAnsi" w:cstheme="minorHAnsi"/>
-        </w:rPr>
-        <w:t xml:space="preserve"> </w:t>
-      </w:r>
-      <w:r>
-        <w:rPr>
-          <w:rFonts w:asciiTheme="minorHAnsi" w:hAnsiTheme="minorHAnsi" w:cstheme="minorHAnsi"/>
-        </w:rPr>
-        <w:t>desde la IP</w:t>
-      </w:r>
-      <w:r>
-        <w:rPr>
-          <w:rFonts w:asciiTheme="minorHAnsi" w:hAnsiTheme="minorHAnsi" w:cstheme="minorHAnsi"/>
-        </w:rPr>
-        <w:t xml:space="preserve"> </w:t>
-      </w:r>
-      <w:r>
-        <w:rPr>
-          <w:rFonts w:asciiTheme="minorHAnsi" w:hAnsiTheme="minorHAnsi" w:cstheme="minorHAnsi"/>
-        </w:rPr>
-        <w:fldChar w:fldCharType="begin"/>
-      </w:r>
-      <w:r>
-        <w:rPr>
-          <w:rFonts w:asciiTheme="minorHAnsi" w:hAnsiTheme="minorHAnsi" w:cstheme="minorHAnsi"/>
-        </w:rPr>
-        <w:instrText xml:space="preserve"> MERGEFIELD  $borrower.IP.addressPP  \* MERGEFORMAT </w:instrText>
-      </w:r>
-      <w:r>
-        <w:rPr>
-          <w:rFonts w:asciiTheme="minorHAnsi" w:hAnsiTheme="minorHAnsi" w:cstheme="minorHAnsi"/>
-        </w:rPr>
-        <w:fldChar w:fldCharType="separate"/>
-      </w:r>
-      <w:r>
-        <w:rPr>
-          <w:rFonts w:asciiTheme="minorHAnsi" w:hAnsiTheme="minorHAnsi" w:cstheme="minorHAnsi"/>
-          <w:noProof/>
-        </w:rPr>
-        <w:t>«$borrower.IP.addressPP»</w:t>
-      </w:r>
-      <w:r>
-        <w:rPr>
-          <w:rFonts w:asciiTheme="minorHAnsi" w:hAnsiTheme="minorHAnsi" w:cstheme="minorHAnsi"/>
-        </w:rPr>
-        <w:fldChar w:fldCharType="end"/>
-      </w:r>
-      <w:r>
-        <w:rPr>
-          <w:rFonts w:asciiTheme="minorHAnsi" w:hAnsiTheme="minorHAnsi" w:cstheme="minorHAnsi"/>
-        </w:rPr>
-        <w:t>.</w:t>
-      </w:r>
-    </w:p>
-    <w:p>
-      <w:pPr>
-        <w:pStyle w:val="a8"/>
-        <w:spacing w:after="0" w:line="240" w:lineRule="auto"/>
-        <w:ind w:left="426" w:right="0" w:firstLine="0"/>
+        <w:ind w:left="0" w:right="0" w:firstLine="0"/>
         <w:rPr>
           <w:rFonts w:asciiTheme="minorHAnsi" w:hAnsiTheme="minorHAnsi" w:cstheme="minorHAnsi"/>
         </w:rPr>
@@ -955,45 +928,16 @@
         <w:spacing w:after="0" w:line="240" w:lineRule="auto"/>
         <w:ind w:left="-6" w:right="0" w:hanging="11"/>
         <w:contextualSpacing/>
-        <w:rPr>
-          <w:rFonts w:asciiTheme="minorHAnsi" w:hAnsiTheme="minorHAnsi" w:cstheme="minorHAnsi"/>
-        </w:rPr>
-      </w:pPr>
-    </w:p>
-    <w:p>
-      <w:pPr>
-        <w:spacing w:after="0" w:line="240" w:lineRule="auto"/>
-        <w:ind w:left="-6" w:right="0" w:hanging="11"/>
-        <w:contextualSpacing/>
-        <w:rPr>
-          <w:rFonts w:asciiTheme="minorHAnsi" w:hAnsiTheme="minorHAnsi" w:cstheme="minorHAnsi"/>
-        </w:rPr>
       </w:pPr>
       <w:r>
         <w:rPr>
           <w:noProof/>
         </w:rPr>
         <w:drawing>
-          <wp:anchor distT="0" distB="0" distL="114300" distR="114300" simplePos="0" relativeHeight="251659264" behindDoc="0" locked="0" layoutInCell="1" allowOverlap="1" wp14:anchorId="1513D1FB" wp14:editId="346B59D5">
-            <wp:simplePos x="0" y="0"/>
-            <wp:positionH relativeFrom="column">
-              <wp:posOffset>0</wp:posOffset>
-            </wp:positionH>
-            <wp:positionV relativeFrom="paragraph">
-              <wp:posOffset>175260</wp:posOffset>
-            </wp:positionV>
-            <wp:extent cx="1314450" cy="563880"/>
-            <wp:effectExtent l="0" t="0" r="0" b="7620"/>
-            <wp:wrapThrough wrapText="bothSides">
-              <wp:wrapPolygon edited="0">
-                <wp:start x="0" y="0"/>
-                <wp:lineTo x="0" y="21162"/>
-                <wp:lineTo x="21287" y="21162"/>
-                <wp:lineTo x="21287" y="0"/>
-                <wp:lineTo x="0" y="0"/>
-              </wp:wrapPolygon>
-            </wp:wrapThrough>
-            <wp:docPr id="114325174" name="Рисунок 6"/>
+          <wp:inline distT="0" distB="0" distL="0" distR="0" wp14:anchorId="4B9DA8B5" wp14:editId="6942477D">
+            <wp:extent cx="1314450" cy="571500"/>
+            <wp:effectExtent l="0" t="0" r="0" b="0"/>
+            <wp:docPr id="154634135" name="drawing"/>
             <wp:cNvGraphicFramePr>
               <a:graphicFrameLocks xmlns:a="http://schemas.openxmlformats.org/drawingml/2006/main" noChangeAspect="1"/>
             </wp:cNvGraphicFramePr>
@@ -1001,14 +945,14 @@
               <a:graphicData uri="http://schemas.openxmlformats.org/drawingml/2006/picture">
                 <pic:pic xmlns:pic="http://schemas.openxmlformats.org/drawingml/2006/picture">
                   <pic:nvPicPr>
-                    <pic:cNvPr id="114325174" name="Рисунок 114325174"/>
+                    <pic:cNvPr id="154634135" name="Picture 154634135"/>
                     <pic:cNvPicPr/>
                   </pic:nvPicPr>
                   <pic:blipFill>
-                    <a:blip r:embed="rId7" cstate="print">
+                    <a:blip r:embed="rId7">
                       <a:extLst>
                         <a:ext uri="{28A0092B-C50C-407E-A947-70E740481C1C}">
-                          <a14:useLocalDpi xmlns:a14="http://schemas.microsoft.com/office/drawing/2010/main" val="0"/>
+                          <a14:useLocalDpi xmlns:a14="http://schemas.microsoft.com/office/drawing/2010/main"/>
                         </a:ext>
                       </a:extLst>
                     </a:blip>
@@ -1019,7 +963,7 @@
                   <pic:spPr>
                     <a:xfrm>
                       <a:off x="0" y="0"/>
-                      <a:ext cx="1314450" cy="563880"/>
+                      <a:ext cx="1314450" cy="571500"/>
                     </a:xfrm>
                     <a:prstGeom prst="rect">
                       <a:avLst/>
@@ -1028,13 +972,7 @@
                 </pic:pic>
               </a:graphicData>
             </a:graphic>
-            <wp14:sizeRelH relativeFrom="page">
-              <wp14:pctWidth>0</wp14:pctWidth>
-            </wp14:sizeRelH>
-            <wp14:sizeRelV relativeFrom="page">
-              <wp14:pctHeight>0</wp14:pctHeight>
-            </wp14:sizeRelV>
-          </wp:anchor>
+          </wp:inline>
         </w:drawing>
       </w:r>
     </w:p>
@@ -1054,43 +992,15 @@
         <w:ind w:left="-6" w:right="0" w:hanging="11"/>
         <w:contextualSpacing/>
         <w:rPr>
-          <w:rFonts w:asciiTheme="minorHAnsi" w:hAnsiTheme="minorHAnsi" w:cstheme="minorHAnsi"/>
-        </w:rPr>
-      </w:pPr>
-    </w:p>
-    <w:p>
-      <w:pPr>
-        <w:spacing w:after="0" w:line="240" w:lineRule="auto"/>
-        <w:ind w:left="-6" w:right="0" w:hanging="11"/>
-        <w:contextualSpacing/>
-        <w:rPr>
-          <w:rFonts w:asciiTheme="minorHAnsi" w:hAnsiTheme="minorHAnsi" w:cstheme="minorHAnsi"/>
-        </w:rPr>
-      </w:pPr>
-    </w:p>
-    <w:p>
-      <w:pPr>
-        <w:spacing w:after="0" w:line="240" w:lineRule="auto"/>
-        <w:ind w:left="-6" w:right="0" w:hanging="11"/>
-        <w:contextualSpacing/>
-        <w:rPr>
-          <w:rFonts w:asciiTheme="minorHAnsi" w:hAnsiTheme="minorHAnsi" w:cstheme="minorHAnsi"/>
-        </w:rPr>
-      </w:pPr>
-    </w:p>
-    <w:p>
-      <w:pPr>
-        <w:spacing w:after="0" w:line="240" w:lineRule="auto"/>
-        <w:ind w:left="-6" w:right="0" w:hanging="11"/>
-        <w:contextualSpacing/>
-        <w:rPr>
-          <w:rFonts w:asciiTheme="minorHAnsi" w:hAnsiTheme="minorHAnsi" w:cstheme="minorHAnsi"/>
+          <w:rFonts w:ascii="Calibri" w:eastAsia="Calibri" w:hAnsi="Calibri" w:cs="Calibri"/>
+          <w:color w:val="000000" w:themeColor="text1"/>
           <w:lang w:val="en-US"/>
         </w:rPr>
       </w:pPr>
       <w:r>
         <w:rPr>
-          <w:rFonts w:asciiTheme="minorHAnsi" w:hAnsiTheme="minorHAnsi" w:cstheme="minorHAnsi"/>
+          <w:rFonts w:ascii="Calibri" w:eastAsia="Calibri" w:hAnsi="Calibri" w:cs="Calibri"/>
+          <w:color w:val="000000" w:themeColor="text1"/>
           <w:lang w:val="en-US"/>
         </w:rPr>
         <w:t>Corrado Graziani</w:t>
@@ -1102,13 +1012,15 @@
         <w:ind w:left="-6" w:right="0" w:hanging="11"/>
         <w:contextualSpacing/>
         <w:rPr>
-          <w:rFonts w:asciiTheme="minorHAnsi" w:hAnsiTheme="minorHAnsi" w:cstheme="minorHAnsi"/>
+          <w:rFonts w:ascii="Calibri" w:eastAsia="Calibri" w:hAnsi="Calibri" w:cs="Calibri"/>
+          <w:color w:val="000000" w:themeColor="text1"/>
           <w:lang w:val="en-US"/>
         </w:rPr>
       </w:pPr>
       <w:r>
         <w:rPr>
-          <w:rFonts w:asciiTheme="minorHAnsi" w:hAnsiTheme="minorHAnsi" w:cstheme="minorHAnsi"/>
+          <w:rFonts w:ascii="Calibri" w:eastAsia="Calibri" w:hAnsi="Calibri" w:cs="Calibri"/>
+          <w:color w:val="000000" w:themeColor="text1"/>
           <w:lang w:val="en-US"/>
         </w:rPr>
         <w:t>Global Head of Collections</w:t>
@@ -1120,15 +1032,33 @@
         <w:ind w:left="-6" w:right="0" w:hanging="11"/>
         <w:contextualSpacing/>
         <w:rPr>
-          <w:rFonts w:asciiTheme="minorHAnsi" w:hAnsiTheme="minorHAnsi" w:cstheme="minorHAnsi"/>
+          <w:rFonts w:asciiTheme="minorHAnsi" w:hAnsiTheme="minorHAnsi" w:cstheme="minorBidi"/>
         </w:rPr>
       </w:pPr>
       <w:r>
         <w:rPr>
-          <w:rFonts w:asciiTheme="minorHAnsi" w:hAnsiTheme="minorHAnsi" w:cstheme="minorHAnsi"/>
+          <w:rFonts w:ascii="Calibri" w:eastAsia="Calibri" w:hAnsi="Calibri" w:cs="Calibri"/>
+          <w:color w:val="000000" w:themeColor="text1"/>
         </w:rPr>
         <w:t>IDFinance Plazo, S.L.U</w:t>
       </w:r>
+      <w:r>
+        <w:rPr>
+          <w:rFonts w:asciiTheme="minorHAnsi" w:hAnsiTheme="minorHAnsi" w:cstheme="minorBidi"/>
+        </w:rPr>
+        <w:t>.</w:t>
+      </w:r>
+    </w:p>
+    <w:p>
+      <w:pPr>
+        <w:spacing w:after="0" w:line="240" w:lineRule="auto"/>
+        <w:ind w:left="-6" w:right="0" w:hanging="11"/>
+        <w:contextualSpacing/>
+        <w:rPr>
+          <w:rFonts w:asciiTheme="minorHAnsi" w:hAnsiTheme="minorHAnsi" w:cstheme="minorHAnsi"/>
+          <w:strike/>
+        </w:rPr>
+      </w:pPr>
     </w:p>
     <w:sectPr>
       <w:pgSz w:w="11906" w:h="16838"/>
@@ -1722,6 +1652,7 @@
   <w:style w:type="paragraph" w:default="1" w:styleId="a">
     <w:name w:val="Normal"/>
     <w:qFormat/>
+    <w:rsid w:val="0021531F"/>
     <w:pPr>
       <w:spacing w:after="155" w:line="258" w:lineRule="auto"/>
       <w:ind w:left="10" w:right="5" w:hanging="10"/>
@@ -1872,6 +1803,11 @@
       <w:rFonts w:ascii="Arial" w:eastAsia="Arial" w:hAnsi="Arial" w:cs="Arial"/>
       <w:color w:val="000000"/>
     </w:rPr>
+  </w:style>
+  <w:style w:type="character" w:customStyle="1" w:styleId="ui-provider">
+    <w:name w:val="ui-provider"/>
+    <w:basedOn w:val="a0"/>
+    <w:rsid w:val="006D5CF7"/>
   </w:style>
 </w:styles>
 </file>

</xml_diff>